<commit_message>
✨ feat: added ability to change document address
</commit_message>
<xml_diff>
--- a/apps/web/templates/XANSHA/HOTEL/Lease Agreement.docx
+++ b/apps/web/templates/XANSHA/HOTEL/Lease Agreement.docx
@@ -748,10 +748,28 @@
         <w:rPr>
           <w:bCs/>
         </w:rPr>
-        <w:t xml:space="preserve">, Республики Казахстан, Улытауская область, Жанааркинский район, поселок Жанаарка, ул. Сарыарка № 6</w:t>
+        <w:t xml:space="preserve">, Республики Казахстан, Улытауская область, Жанааркинский район, поселок Жанаарка, ул. </w:t>
       </w:r>
       <w:r>
-        <w:t xml:space="preserve">, ком №6</w:t>
+        <w:rPr>
+          <w:bCs/>
+          <w:lang w:val="en-US"/>
+        </w:rPr>
+        <w:t xml:space="preserve">{</w:t>
+      </w:r>
+      <w:r>
+        <w:rPr>
+          <w:bCs/>
+          <w:lang w:val="en-US"/>
+        </w:rPr>
+        <w:t xml:space="preserve">documentAddress</w:t>
+      </w:r>
+      <w:r>
+        <w:rPr>
+          <w:bCs/>
+          <w:lang w:val="en-US"/>
+        </w:rPr>
+        <w:t xml:space="preserve">}</w:t>
       </w:r>
       <w:r>
         <w:t xml:space="preserve"> </w:t>
@@ -1102,12 +1120,6 @@
         </w:rPr>
         <w:t xml:space="preserve">) тенге</w:t>
       </w:r>
-      <w:r/>
-      <w:r>
-        <w:rPr>
-          <w:color w:val="auto"/>
-        </w:rPr>
-      </w:r>
       <w:r>
         <w:rPr>
           <w:color w:val="auto"/>
@@ -1121,8 +1133,11 @@
         </w:rPr>
         <w:t xml:space="preserve"> тиын</w:t>
       </w:r>
-      <w:r/>
-      <w:r/>
+      <w:r>
+        <w:rPr>
+          <w:color w:val="auto"/>
+        </w:rPr>
+      </w:r>
       <w:r>
         <w:rPr>
           <w:color w:val="auto"/>

</xml_diff>